<commit_message>
This the first version of the documentation for the visual programming project
</commit_message>
<xml_diff>
--- a/Documentations/Student Registration Portal-specifications-version 1.docx
+++ b/Documentations/Student Registration Portal-specifications-version 1.docx
@@ -722,6 +722,7 @@
             <w:tabs>
               <w:tab w:val="right" w:leader="dot" w:pos="9350"/>
             </w:tabs>
+            <w:jc w:val="both"/>
             <w:rPr>
               <w:rFonts w:eastAsiaTheme="minorEastAsia"/>
               <w:noProof/>
@@ -800,6 +801,7 @@
             <w:tabs>
               <w:tab w:val="right" w:leader="dot" w:pos="9350"/>
             </w:tabs>
+            <w:jc w:val="both"/>
             <w:rPr>
               <w:rFonts w:eastAsiaTheme="minorEastAsia"/>
               <w:noProof/>
@@ -869,6 +871,7 @@
             <w:tabs>
               <w:tab w:val="right" w:leader="dot" w:pos="9350"/>
             </w:tabs>
+            <w:jc w:val="both"/>
             <w:rPr>
               <w:rFonts w:eastAsiaTheme="minorEastAsia"/>
               <w:noProof/>
@@ -938,6 +941,7 @@
             <w:tabs>
               <w:tab w:val="right" w:leader="dot" w:pos="9350"/>
             </w:tabs>
+            <w:jc w:val="both"/>
             <w:rPr>
               <w:rFonts w:eastAsiaTheme="minorEastAsia"/>
               <w:noProof/>
@@ -1007,6 +1011,7 @@
             <w:tabs>
               <w:tab w:val="right" w:leader="dot" w:pos="9350"/>
             </w:tabs>
+            <w:jc w:val="both"/>
             <w:rPr>
               <w:rFonts w:eastAsiaTheme="minorEastAsia"/>
               <w:noProof/>
@@ -1076,6 +1081,7 @@
             <w:tabs>
               <w:tab w:val="right" w:leader="dot" w:pos="9350"/>
             </w:tabs>
+            <w:jc w:val="both"/>
             <w:rPr>
               <w:rFonts w:eastAsiaTheme="minorEastAsia"/>
               <w:noProof/>
@@ -1145,6 +1151,7 @@
             <w:tabs>
               <w:tab w:val="right" w:leader="dot" w:pos="9350"/>
             </w:tabs>
+            <w:jc w:val="both"/>
             <w:rPr>
               <w:rFonts w:eastAsiaTheme="minorEastAsia"/>
               <w:noProof/>
@@ -1214,6 +1221,7 @@
             <w:tabs>
               <w:tab w:val="right" w:leader="dot" w:pos="9350"/>
             </w:tabs>
+            <w:jc w:val="both"/>
             <w:rPr>
               <w:rFonts w:eastAsiaTheme="minorEastAsia"/>
               <w:noProof/>
@@ -1283,6 +1291,7 @@
             <w:tabs>
               <w:tab w:val="right" w:leader="dot" w:pos="9350"/>
             </w:tabs>
+            <w:jc w:val="both"/>
             <w:rPr>
               <w:rFonts w:eastAsiaTheme="minorEastAsia"/>
               <w:noProof/>
@@ -1352,6 +1361,7 @@
             <w:tabs>
               <w:tab w:val="right" w:leader="dot" w:pos="9350"/>
             </w:tabs>
+            <w:jc w:val="both"/>
             <w:rPr>
               <w:rFonts w:eastAsiaTheme="minorEastAsia"/>
               <w:noProof/>
@@ -1932,6 +1942,7 @@
     <w:p>
       <w:pPr>
         <w:pStyle w:val="Heading2"/>
+        <w:jc w:val="both"/>
       </w:pPr>
       <w:bookmarkStart w:id="7" w:name="_Toc243832015"/>
       <w:r>
@@ -1940,6 +1951,9 @@
       <w:bookmarkEnd w:id="7"/>
     </w:p>
     <w:p>
+      <w:pPr>
+        <w:jc w:val="both"/>
+      </w:pPr>
       <w:r>
         <w:t xml:space="preserve">FR-A1: The system must </w:t>
       </w:r>
@@ -1948,6 +1962,9 @@
       </w:r>
     </w:p>
     <w:p>
+      <w:pPr>
+        <w:jc w:val="both"/>
+      </w:pPr>
       <w:r>
         <w:t xml:space="preserve">FR-A2: The system must </w:t>
       </w:r>
@@ -1956,21 +1973,33 @@
       </w:r>
     </w:p>
     <w:p>
+      <w:pPr>
+        <w:jc w:val="both"/>
+      </w:pPr>
       <w:r>
         <w:t>FR-A3: The system must generate reports of enrollment statistics, course capacity and other data of administrative use</w:t>
       </w:r>
     </w:p>
     <w:p>
+      <w:pPr>
+        <w:jc w:val="both"/>
+      </w:pPr>
       <w:r>
         <w:t>FR-A4: The system must have authentication via university E-mail</w:t>
       </w:r>
     </w:p>
     <w:p>
+      <w:pPr>
+        <w:jc w:val="both"/>
+      </w:pPr>
       <w:r>
         <w:t>FR-A5: The system must allow the staff to create new student accounts and manage existing accounts</w:t>
       </w:r>
     </w:p>
     <w:p>
+      <w:pPr>
+        <w:jc w:val="both"/>
+      </w:pPr>
       <w:r>
         <w:t xml:space="preserve">FR-A6: The system must </w:t>
       </w:r>
@@ -1979,6 +2008,9 @@
       </w:r>
     </w:p>
     <w:p>
+      <w:pPr>
+        <w:jc w:val="both"/>
+      </w:pPr>
       <w:r>
         <w:t xml:space="preserve">FR-A7: The system must </w:t>
       </w:r>
@@ -1989,6 +2021,7 @@
     <w:p>
       <w:pPr>
         <w:pStyle w:val="Heading2"/>
+        <w:jc w:val="both"/>
       </w:pPr>
       <w:bookmarkStart w:id="8" w:name="_Toc243832016"/>
       <w:r>
@@ -1997,6 +2030,9 @@
       <w:bookmarkEnd w:id="8"/>
     </w:p>
     <w:p>
+      <w:pPr>
+        <w:jc w:val="both"/>
+      </w:pPr>
       <w:r>
         <w:t>FR-I1: The system must notify the instructors when the</w:t>
       </w:r>
@@ -2005,16 +2041,25 @@
       </w:r>
     </w:p>
     <w:p>
+      <w:pPr>
+        <w:jc w:val="both"/>
+      </w:pPr>
       <w:r>
         <w:t>FR-I2: The system must have authentication via university E-mail</w:t>
       </w:r>
     </w:p>
     <w:p>
+      <w:pPr>
+        <w:jc w:val="both"/>
+      </w:pPr>
       <w:r>
         <w:t>FR-I3: The system must provide contact with the Head of Department</w:t>
       </w:r>
     </w:p>
     <w:p>
+      <w:pPr>
+        <w:jc w:val="both"/>
+      </w:pPr>
       <w:r>
         <w:t>FR-I4: The system must allow access to course syllabus</w:t>
       </w:r>
@@ -2022,6 +2067,7 @@
     <w:p>
       <w:pPr>
         <w:pStyle w:val="Heading2"/>
+        <w:jc w:val="both"/>
       </w:pPr>
       <w:bookmarkStart w:id="9" w:name="_Toc243832017"/>
       <w:r>
@@ -2030,6 +2076,9 @@
       <w:bookmarkEnd w:id="9"/>
     </w:p>
     <w:p>
+      <w:pPr>
+        <w:jc w:val="both"/>
+      </w:pPr>
       <w:r>
         <w:t xml:space="preserve">FR-AD1: </w:t>
       </w:r>
@@ -2039,6 +2088,7 @@
     </w:p>
     <w:p>
       <w:pPr>
+        <w:jc w:val="both"/>
         <w:rPr>
           <w:lang w:bidi="ar-JO"/>
         </w:rPr>
@@ -2076,6 +2126,7 @@
     </w:p>
     <w:p>
       <w:pPr>
+        <w:jc w:val="both"/>
         <w:rPr>
           <w:lang w:bidi="ar-JO"/>
         </w:rPr>
@@ -2089,6 +2140,7 @@
     </w:p>
     <w:p>
       <w:pPr>
+        <w:jc w:val="both"/>
         <w:rPr>
           <w:lang w:bidi="ar-JO"/>
         </w:rPr>
@@ -3817,8 +3869,10 @@
     <w:rsidRoot w:val="002D74C7"/>
     <w:rsid w:val="00081E82"/>
     <w:rsid w:val="002D74C7"/>
+    <w:rsid w:val="00327AD4"/>
     <w:rsid w:val="003D2799"/>
     <w:rsid w:val="004E1925"/>
+    <w:rsid w:val="006975DF"/>
     <w:rsid w:val="00762A35"/>
     <w:rsid w:val="00773CAA"/>
     <w:rsid w:val="007E591F"/>

</xml_diff>